<commit_message>
Updated paper structure guidelines
</commit_message>
<xml_diff>
--- a/Research/GroupInternal/Papers/paper_structure_guidelines.docx
+++ b/Research/GroupInternal/Papers/paper_structure_guidelines.docx
@@ -120,7 +120,7 @@
         <w:rPr>
           <w:b/>
         </w:rPr>
-        <w:t>February 11</w:t>
+        <w:t>May 6</w:t>
       </w:r>
       <w:r>
         <w:rPr>
@@ -309,7 +309,23 @@
           <w:sz w:val="22"/>
           <w:szCs w:val="22"/>
         </w:rPr>
-        <w:t xml:space="preserve">Often what goes hand-in-hand with this is a motivating result figure, right in the introduction. At a high level, this tells the reviewer how bad the current state-of-the-art is. Optionally, the figure includes a teaser result of our own solution. This gives the reviewer an idea of how much better our solution is over the SOTA. Take care to state, without too much detail, what the experimental configuration is. </w:t>
+        <w:t xml:space="preserve">Often what goes </w:t>
+      </w:r>
+      <w:proofErr w:type="gramStart"/>
+      <w:r>
+        <w:rPr>
+          <w:sz w:val="22"/>
+          <w:szCs w:val="22"/>
+        </w:rPr>
+        <w:t>hand-in-hand</w:t>
+      </w:r>
+      <w:proofErr w:type="gramEnd"/>
+      <w:r>
+        <w:rPr>
+          <w:sz w:val="22"/>
+          <w:szCs w:val="22"/>
+        </w:rPr>
+        <w:t xml:space="preserve"> with this is a motivating result figure, right in the introduction. At a high level, this tells the reviewer how bad the current state-of-the-art is. Optionally, the figure includes a teaser result of our own solution. This gives the reviewer an idea of how much better our solution is over the SOTA. Take care to state, without too much detail, what the experimental configuration is. </w:t>
       </w:r>
     </w:p>
     <w:p>
@@ -526,7 +542,23 @@
           <w:sz w:val="22"/>
           <w:szCs w:val="22"/>
         </w:rPr>
-        <w:t xml:space="preserve"> How have other people solved this problem and why your design is better or more suitable?</w:t>
+        <w:t xml:space="preserve"> How have other people solved this problem and why </w:t>
+      </w:r>
+      <w:proofErr w:type="gramStart"/>
+      <w:r>
+        <w:rPr>
+          <w:sz w:val="22"/>
+          <w:szCs w:val="22"/>
+        </w:rPr>
+        <w:t>your design is</w:t>
+      </w:r>
+      <w:proofErr w:type="gramEnd"/>
+      <w:r>
+        <w:rPr>
+          <w:sz w:val="22"/>
+          <w:szCs w:val="22"/>
+        </w:rPr>
+        <w:t xml:space="preserve"> better or more suitable?</w:t>
       </w:r>
     </w:p>
     <w:p>
@@ -657,12 +689,21 @@
         </w:rPr>
         <w:t xml:space="preserve"> needs to be backed up with experiments or analysis to show that you meet the claims. Often reviewers do a quick sanity check between the claims and what you demonstrate. </w:t>
       </w:r>
-      <w:r>
-        <w:rPr>
-          <w:sz w:val="22"/>
-          <w:szCs w:val="22"/>
-        </w:rPr>
-        <w:t xml:space="preserve">So it is </w:t>
+      <w:proofErr w:type="gramStart"/>
+      <w:r>
+        <w:rPr>
+          <w:sz w:val="22"/>
+          <w:szCs w:val="22"/>
+        </w:rPr>
+        <w:t>So</w:t>
+      </w:r>
+      <w:proofErr w:type="gramEnd"/>
+      <w:r>
+        <w:rPr>
+          <w:sz w:val="22"/>
+          <w:szCs w:val="22"/>
+        </w:rPr>
+        <w:t xml:space="preserve"> it is </w:t>
       </w:r>
       <w:r>
         <w:rPr>
@@ -847,12 +888,21 @@
         </w:rPr>
         <w:t xml:space="preserve"> unambiguously specified description. </w:t>
       </w:r>
-      <w:r>
-        <w:rPr>
-          <w:sz w:val="22"/>
-          <w:szCs w:val="22"/>
-        </w:rPr>
-        <w:t xml:space="preserve">Similarly when you are describing a scheme, first describe it rigorously, using notations and symbols if need be. Only then, if you think it helps the clarity (and it often does), give an illustrating example. </w:t>
+      <w:proofErr w:type="gramStart"/>
+      <w:r>
+        <w:rPr>
+          <w:sz w:val="22"/>
+          <w:szCs w:val="22"/>
+        </w:rPr>
+        <w:t>Similarly</w:t>
+      </w:r>
+      <w:proofErr w:type="gramEnd"/>
+      <w:r>
+        <w:rPr>
+          <w:sz w:val="22"/>
+          <w:szCs w:val="22"/>
+        </w:rPr>
+        <w:t xml:space="preserve"> when you are describing a scheme, first describe it rigorously, using notations and symbols if need be. Only then, if you think it helps the clarity (and it often does), give an illustrating example. </w:t>
       </w:r>
       <w:r>
         <w:rPr>
@@ -977,14 +1027,78 @@
           <w:sz w:val="22"/>
           <w:szCs w:val="22"/>
         </w:rPr>
-        <w:t>Put 2-3 of the most important results in the introduction. These should be the high-level eye-catching ones that will cause someone to read the rest of the paper. Also these should be understandable to the reader who does not yet know the details of your technique. These results are often repeated in the conclusion.</w:t>
-      </w:r>
-      <w:r>
-        <w:rPr>
-          <w:sz w:val="22"/>
-          <w:szCs w:val="22"/>
-        </w:rPr>
-        <w:t xml:space="preserve"> Example: We show that our protocol is able to detect 95% of single errors. By comparison, the state-of-the-art [Reference] is able to detect 60% of the same set of errors. </w:t>
+        <w:t xml:space="preserve">Put 2-3 of the most important results in the introduction. These should be the high-level eye-catching ones that will cause someone to read the rest of the paper. </w:t>
+      </w:r>
+      <w:proofErr w:type="gramStart"/>
+      <w:r>
+        <w:rPr>
+          <w:sz w:val="22"/>
+          <w:szCs w:val="22"/>
+        </w:rPr>
+        <w:t>Also</w:t>
+      </w:r>
+      <w:proofErr w:type="gramEnd"/>
+      <w:r>
+        <w:rPr>
+          <w:sz w:val="22"/>
+          <w:szCs w:val="22"/>
+        </w:rPr>
+        <w:t xml:space="preserve"> these should be understandable to the reader who does not yet know the details of your technique. These results are often repeated in </w:t>
+      </w:r>
+      <w:proofErr w:type="gramStart"/>
+      <w:r>
+        <w:rPr>
+          <w:sz w:val="22"/>
+          <w:szCs w:val="22"/>
+        </w:rPr>
+        <w:t>the conclusion</w:t>
+      </w:r>
+      <w:proofErr w:type="gramEnd"/>
+      <w:r>
+        <w:rPr>
+          <w:sz w:val="22"/>
+          <w:szCs w:val="22"/>
+        </w:rPr>
+        <w:t>.</w:t>
+      </w:r>
+      <w:r>
+        <w:rPr>
+          <w:sz w:val="22"/>
+          <w:szCs w:val="22"/>
+        </w:rPr>
+        <w:t xml:space="preserve"> Example: We show that our protocol </w:t>
+      </w:r>
+      <w:proofErr w:type="gramStart"/>
+      <w:r>
+        <w:rPr>
+          <w:sz w:val="22"/>
+          <w:szCs w:val="22"/>
+        </w:rPr>
+        <w:t>is able to</w:t>
+      </w:r>
+      <w:proofErr w:type="gramEnd"/>
+      <w:r>
+        <w:rPr>
+          <w:sz w:val="22"/>
+          <w:szCs w:val="22"/>
+        </w:rPr>
+        <w:t xml:space="preserve"> detect 95% of single errors. By comparison, the state-of-the-art [Reference] </w:t>
+      </w:r>
+      <w:proofErr w:type="gramStart"/>
+      <w:r>
+        <w:rPr>
+          <w:sz w:val="22"/>
+          <w:szCs w:val="22"/>
+        </w:rPr>
+        <w:t>is able to</w:t>
+      </w:r>
+      <w:proofErr w:type="gramEnd"/>
+      <w:r>
+        <w:rPr>
+          <w:sz w:val="22"/>
+          <w:szCs w:val="22"/>
+        </w:rPr>
+        <w:t xml:space="preserve"> detect 60% of the same set of errors. </w:t>
       </w:r>
       <w:r>
         <w:rPr>
@@ -1055,7 +1169,39 @@
           <w:sz w:val="22"/>
           <w:szCs w:val="22"/>
         </w:rPr>
-        <w:t xml:space="preserve">Example from our Usenix ATC-18 paper (“VideoChef”): </w:t>
+        <w:t xml:space="preserve">Example from our </w:t>
+      </w:r>
+      <w:proofErr w:type="spellStart"/>
+      <w:r>
+        <w:rPr>
+          <w:sz w:val="22"/>
+          <w:szCs w:val="22"/>
+        </w:rPr>
+        <w:t>Usenix</w:t>
+      </w:r>
+      <w:proofErr w:type="spellEnd"/>
+      <w:r>
+        <w:rPr>
+          <w:sz w:val="22"/>
+          <w:szCs w:val="22"/>
+        </w:rPr>
+        <w:t xml:space="preserve"> ATC-18 paper (“</w:t>
+      </w:r>
+      <w:proofErr w:type="spellStart"/>
+      <w:r>
+        <w:rPr>
+          <w:sz w:val="22"/>
+          <w:szCs w:val="22"/>
+        </w:rPr>
+        <w:t>VideoChef</w:t>
+      </w:r>
+      <w:proofErr w:type="spellEnd"/>
+      <w:r>
+        <w:rPr>
+          <w:sz w:val="22"/>
+          <w:szCs w:val="22"/>
+        </w:rPr>
+        <w:t xml:space="preserve">”): </w:t>
       </w:r>
     </w:p>
     <w:p>
@@ -1084,8 +1230,18 @@
           <w:sz w:val="22"/>
           <w:szCs w:val="22"/>
         </w:rPr>
-        <w:t>Content-dependent  Approximation</w:t>
-      </w:r>
+        <w:t>Content-</w:t>
+      </w:r>
+      <w:proofErr w:type="gramStart"/>
+      <w:r>
+        <w:rPr>
+          <w:b/>
+          <w:sz w:val="22"/>
+          <w:szCs w:val="22"/>
+        </w:rPr>
+        <w:t>dependent  Approximation</w:t>
+      </w:r>
+      <w:proofErr w:type="gramEnd"/>
       <w:r>
         <w:rPr>
           <w:sz w:val="22"/>
@@ -1100,6 +1256,7 @@
         </w:rPr>
         <w:t xml:space="preserve"> </w:t>
       </w:r>
+      <w:proofErr w:type="gramStart"/>
       <w:r>
         <w:rPr>
           <w:sz w:val="22"/>
@@ -1107,6 +1264,7 @@
         </w:rPr>
         <w:t>A  fundamental</w:t>
       </w:r>
+      <w:proofErr w:type="gramEnd"/>
       <w:r>
         <w:rPr>
           <w:sz w:val="22"/>
@@ -1140,29 +1298,118 @@
           <w:sz w:val="22"/>
           <w:szCs w:val="22"/>
         </w:rPr>
-        <w:t>inding the con</w:t>
-      </w:r>
-      <w:r>
-        <w:rPr>
-          <w:sz w:val="22"/>
-          <w:szCs w:val="22"/>
-        </w:rPr>
-        <w:t>figurations  of  these  app</w:t>
-      </w:r>
-      <w:r>
-        <w:rPr>
-          <w:sz w:val="22"/>
-          <w:szCs w:val="22"/>
-        </w:rPr>
-        <w:t>roximations  that  provide  max</w:t>
-      </w:r>
-      <w:r>
-        <w:rPr>
-          <w:sz w:val="22"/>
-          <w:szCs w:val="22"/>
-        </w:rPr>
-        <w:t>imum  savings,  while  providing  acceptable  results  for</w:t>
-      </w:r>
+        <w:t xml:space="preserve">inding the </w:t>
+      </w:r>
+      <w:proofErr w:type="gramStart"/>
+      <w:r>
+        <w:rPr>
+          <w:sz w:val="22"/>
+          <w:szCs w:val="22"/>
+        </w:rPr>
+        <w:t>con</w:t>
+      </w:r>
+      <w:r>
+        <w:rPr>
+          <w:sz w:val="22"/>
+          <w:szCs w:val="22"/>
+        </w:rPr>
+        <w:t>figurations  of</w:t>
+      </w:r>
+      <w:proofErr w:type="gramEnd"/>
+      <w:r>
+        <w:rPr>
+          <w:sz w:val="22"/>
+          <w:szCs w:val="22"/>
+        </w:rPr>
+        <w:t xml:space="preserve">  </w:t>
+      </w:r>
+      <w:proofErr w:type="gramStart"/>
+      <w:r>
+        <w:rPr>
+          <w:sz w:val="22"/>
+          <w:szCs w:val="22"/>
+        </w:rPr>
+        <w:t>these  app</w:t>
+      </w:r>
+      <w:r>
+        <w:rPr>
+          <w:sz w:val="22"/>
+          <w:szCs w:val="22"/>
+        </w:rPr>
+        <w:t>roximations</w:t>
+      </w:r>
+      <w:proofErr w:type="gramEnd"/>
+      <w:r>
+        <w:rPr>
+          <w:sz w:val="22"/>
+          <w:szCs w:val="22"/>
+        </w:rPr>
+        <w:t xml:space="preserve">  </w:t>
+      </w:r>
+      <w:proofErr w:type="gramStart"/>
+      <w:r>
+        <w:rPr>
+          <w:sz w:val="22"/>
+          <w:szCs w:val="22"/>
+        </w:rPr>
+        <w:t>that  provide</w:t>
+      </w:r>
+      <w:proofErr w:type="gramEnd"/>
+      <w:r>
+        <w:rPr>
+          <w:sz w:val="22"/>
+          <w:szCs w:val="22"/>
+        </w:rPr>
+        <w:t xml:space="preserve">  </w:t>
+      </w:r>
+      <w:proofErr w:type="gramStart"/>
+      <w:r>
+        <w:rPr>
+          <w:sz w:val="22"/>
+          <w:szCs w:val="22"/>
+        </w:rPr>
+        <w:t>max</w:t>
+      </w:r>
+      <w:r>
+        <w:rPr>
+          <w:sz w:val="22"/>
+          <w:szCs w:val="22"/>
+        </w:rPr>
+        <w:t>imum  savings,  while</w:t>
+      </w:r>
+      <w:proofErr w:type="gramEnd"/>
+      <w:r>
+        <w:rPr>
+          <w:sz w:val="22"/>
+          <w:szCs w:val="22"/>
+        </w:rPr>
+        <w:t xml:space="preserve">  </w:t>
+      </w:r>
+      <w:proofErr w:type="gramStart"/>
+      <w:r>
+        <w:rPr>
+          <w:sz w:val="22"/>
+          <w:szCs w:val="22"/>
+        </w:rPr>
+        <w:t>providing  acceptable</w:t>
+      </w:r>
+      <w:proofErr w:type="gramEnd"/>
+      <w:r>
+        <w:rPr>
+          <w:sz w:val="22"/>
+          <w:szCs w:val="22"/>
+        </w:rPr>
+        <w:t xml:space="preserve">  </w:t>
+      </w:r>
+      <w:proofErr w:type="gramStart"/>
+      <w:r>
+        <w:rPr>
+          <w:sz w:val="22"/>
+          <w:szCs w:val="22"/>
+        </w:rPr>
+        <w:t>results  for</w:t>
+      </w:r>
+      <w:proofErr w:type="gramEnd"/>
       <w:r>
         <w:rPr>
           <w:sz w:val="22"/>
@@ -1200,7 +1447,23 @@
           <w:sz w:val="22"/>
           <w:szCs w:val="22"/>
         </w:rPr>
-        <w:t xml:space="preserve">Now it goes on to show at a high-level that there are prior attempts to solve these two parts, but they fail. </w:t>
+        <w:t xml:space="preserve">Now it goes on to show at a </w:t>
+      </w:r>
+      <w:proofErr w:type="gramStart"/>
+      <w:r>
+        <w:rPr>
+          <w:sz w:val="22"/>
+          <w:szCs w:val="22"/>
+        </w:rPr>
+        <w:t>high-level</w:t>
+      </w:r>
+      <w:proofErr w:type="gramEnd"/>
+      <w:r>
+        <w:rPr>
+          <w:sz w:val="22"/>
+          <w:szCs w:val="22"/>
+        </w:rPr>
+        <w:t xml:space="preserve"> that there are prior attempts to solve these two parts, but they fail. </w:t>
       </w:r>
     </w:p>
     <w:p>
@@ -1222,7 +1485,39 @@
           <w:szCs w:val="22"/>
         </w:rPr>
         <w:lastRenderedPageBreak/>
-        <w:t xml:space="preserve">One useful construct in the introduction is to highlight a key intuition or two that underlies our solution. For example in our Eurosys 16 paper (“Partial-Parallel-Repair (PPR)” </w:t>
+        <w:t xml:space="preserve">One useful construct in the introduction is to highlight a key intuition or two that underlies our solution. For </w:t>
+      </w:r>
+      <w:proofErr w:type="gramStart"/>
+      <w:r>
+        <w:rPr>
+          <w:sz w:val="22"/>
+          <w:szCs w:val="22"/>
+        </w:rPr>
+        <w:t>example</w:t>
+      </w:r>
+      <w:proofErr w:type="gramEnd"/>
+      <w:r>
+        <w:rPr>
+          <w:sz w:val="22"/>
+          <w:szCs w:val="22"/>
+        </w:rPr>
+        <w:t xml:space="preserve"> in our </w:t>
+      </w:r>
+      <w:proofErr w:type="spellStart"/>
+      <w:r>
+        <w:rPr>
+          <w:sz w:val="22"/>
+          <w:szCs w:val="22"/>
+        </w:rPr>
+        <w:t>Eurosys</w:t>
+      </w:r>
+      <w:proofErr w:type="spellEnd"/>
+      <w:r>
+        <w:rPr>
+          <w:sz w:val="22"/>
+          <w:szCs w:val="22"/>
+        </w:rPr>
+        <w:t xml:space="preserve"> 16 paper (“Partial-Parallel-Repair (PPR)” </w:t>
       </w:r>
       <w:r>
         <w:rPr>
@@ -1646,8 +1941,17 @@
           <w:sz w:val="22"/>
           <w:szCs w:val="22"/>
         </w:rPr>
-        <w:t>The concept of data-aware checkpoint compression, which significantly increases the compressibility of checkpoints;</w:t>
-      </w:r>
+        <w:t xml:space="preserve">The concept of data-aware checkpoint compression, which significantly increases the compressibility of </w:t>
+      </w:r>
+      <w:proofErr w:type="gramStart"/>
+      <w:r>
+        <w:rPr>
+          <w:sz w:val="22"/>
+          <w:szCs w:val="22"/>
+        </w:rPr>
+        <w:t>checkpoints;</w:t>
+      </w:r>
+      <w:proofErr w:type="gramEnd"/>
     </w:p>
     <w:p>
       <w:pPr>
@@ -1667,8 +1971,17 @@
           <w:sz w:val="22"/>
           <w:szCs w:val="22"/>
         </w:rPr>
-        <w:t>A thorough investigation of the application-specific impact of different aggregation schemes on compression ratio;</w:t>
-      </w:r>
+        <w:t xml:space="preserve">A thorough investigation of the application-specific impact of different aggregation schemes on compression </w:t>
+      </w:r>
+      <w:proofErr w:type="gramStart"/>
+      <w:r>
+        <w:rPr>
+          <w:sz w:val="22"/>
+          <w:szCs w:val="22"/>
+        </w:rPr>
+        <w:t>ratio;</w:t>
+      </w:r>
+      <w:proofErr w:type="gramEnd"/>
     </w:p>
     <w:p>
       <w:pPr>
@@ -1706,7 +2019,23 @@
           <w:sz w:val="22"/>
           <w:szCs w:val="22"/>
         </w:rPr>
-        <w:t xml:space="preserve">In the conclusion, you should mention what are the insights you obtained from this work. For example: Through this work, we showed that it is possible to reprogram a 100-node wireless network in a multi-hop manner within 5 seconds. </w:t>
+        <w:t xml:space="preserve">In </w:t>
+      </w:r>
+      <w:proofErr w:type="gramStart"/>
+      <w:r>
+        <w:rPr>
+          <w:sz w:val="22"/>
+          <w:szCs w:val="22"/>
+        </w:rPr>
+        <w:t>the conclusion</w:t>
+      </w:r>
+      <w:proofErr w:type="gramEnd"/>
+      <w:r>
+        <w:rPr>
+          <w:sz w:val="22"/>
+          <w:szCs w:val="22"/>
+        </w:rPr>
+        <w:t xml:space="preserve">, you should mention what are the insights you obtained from this work. For example: Through this work, we showed that it is possible to reprogram a 100-node wireless network in a multi-hop manner within 5 seconds. </w:t>
       </w:r>
     </w:p>
     <w:p>
@@ -1785,7 +2114,23 @@
           <w:sz w:val="22"/>
           <w:szCs w:val="22"/>
         </w:rPr>
-        <w:t xml:space="preserve">. One of the points of comparison can be a naïve or simple protocol, of the kind that a reader may readily think of. </w:t>
+        <w:t xml:space="preserve">. One of the points of comparison can be a </w:t>
+      </w:r>
+      <w:proofErr w:type="gramStart"/>
+      <w:r>
+        <w:rPr>
+          <w:sz w:val="22"/>
+          <w:szCs w:val="22"/>
+        </w:rPr>
+        <w:t>naïve</w:t>
+      </w:r>
+      <w:proofErr w:type="gramEnd"/>
+      <w:r>
+        <w:rPr>
+          <w:sz w:val="22"/>
+          <w:szCs w:val="22"/>
+        </w:rPr>
+        <w:t xml:space="preserve"> or simple protocol, of the kind that a reader may readily think of. </w:t>
       </w:r>
       <w:r>
         <w:rPr>
@@ -1841,14 +2186,46 @@
           <w:sz w:val="22"/>
           <w:szCs w:val="22"/>
         </w:rPr>
-        <w:t>appeared in the literature in the recent past</w:t>
-      </w:r>
-      <w:r>
-        <w:rPr>
-          <w:sz w:val="22"/>
-          <w:szCs w:val="22"/>
-        </w:rPr>
-        <w:t xml:space="preserve"> from a top tier conference</w:t>
+        <w:t xml:space="preserve">appeared in </w:t>
+      </w:r>
+      <w:proofErr w:type="gramStart"/>
+      <w:r>
+        <w:rPr>
+          <w:sz w:val="22"/>
+          <w:szCs w:val="22"/>
+        </w:rPr>
+        <w:t>the literature</w:t>
+      </w:r>
+      <w:proofErr w:type="gramEnd"/>
+      <w:r>
+        <w:rPr>
+          <w:sz w:val="22"/>
+          <w:szCs w:val="22"/>
+        </w:rPr>
+        <w:t xml:space="preserve"> in the recent past</w:t>
+      </w:r>
+      <w:r>
+        <w:rPr>
+          <w:sz w:val="22"/>
+          <w:szCs w:val="22"/>
+        </w:rPr>
+        <w:t xml:space="preserve"> from a </w:t>
+      </w:r>
+      <w:proofErr w:type="gramStart"/>
+      <w:r>
+        <w:rPr>
+          <w:sz w:val="22"/>
+          <w:szCs w:val="22"/>
+        </w:rPr>
+        <w:t>top tier</w:t>
+      </w:r>
+      <w:proofErr w:type="gramEnd"/>
+      <w:r>
+        <w:rPr>
+          <w:sz w:val="22"/>
+          <w:szCs w:val="22"/>
+        </w:rPr>
+        <w:t xml:space="preserve"> conference</w:t>
       </w:r>
       <w:r>
         <w:rPr>
@@ -1869,7 +2246,39 @@
           <w:sz w:val="22"/>
           <w:szCs w:val="22"/>
         </w:rPr>
-        <w:t xml:space="preserve">the leading candidates for the state-of-the-art. This part is sometime quite painful where you have to implement someone else’s protocol. </w:t>
+        <w:t xml:space="preserve">the leading candidates for </w:t>
+      </w:r>
+      <w:proofErr w:type="gramStart"/>
+      <w:r>
+        <w:rPr>
+          <w:sz w:val="22"/>
+          <w:szCs w:val="22"/>
+        </w:rPr>
+        <w:t>the state</w:t>
+      </w:r>
+      <w:proofErr w:type="gramEnd"/>
+      <w:r>
+        <w:rPr>
+          <w:sz w:val="22"/>
+          <w:szCs w:val="22"/>
+        </w:rPr>
+        <w:t xml:space="preserve">-of-the-art. This part is sometime quite painful where you </w:t>
+      </w:r>
+      <w:proofErr w:type="gramStart"/>
+      <w:r>
+        <w:rPr>
+          <w:sz w:val="22"/>
+          <w:szCs w:val="22"/>
+        </w:rPr>
+        <w:t>have to</w:t>
+      </w:r>
+      <w:proofErr w:type="gramEnd"/>
+      <w:r>
+        <w:rPr>
+          <w:sz w:val="22"/>
+          <w:szCs w:val="22"/>
+        </w:rPr>
+        <w:t xml:space="preserve"> implement someone else’s protocol. </w:t>
       </w:r>
       <w:r>
         <w:rPr>
@@ -1897,7 +2306,23 @@
           <w:sz w:val="22"/>
           <w:szCs w:val="22"/>
         </w:rPr>
-        <w:t xml:space="preserve">core of it that will let you run the experiments. If a paper has appeared on the topic in the same </w:t>
+        <w:t xml:space="preserve">core of </w:t>
+      </w:r>
+      <w:proofErr w:type="gramStart"/>
+      <w:r>
+        <w:rPr>
+          <w:sz w:val="22"/>
+          <w:szCs w:val="22"/>
+        </w:rPr>
+        <w:t>it that</w:t>
+      </w:r>
+      <w:proofErr w:type="gramEnd"/>
+      <w:r>
+        <w:rPr>
+          <w:sz w:val="22"/>
+          <w:szCs w:val="22"/>
+        </w:rPr>
+        <w:t xml:space="preserve"> will let you run the experiments. If a paper has appeared on the topic in the same </w:t>
       </w:r>
       <w:r>
         <w:rPr>
@@ -1912,7 +2337,23 @@
           <w:sz w:val="22"/>
           <w:szCs w:val="22"/>
         </w:rPr>
-        <w:t xml:space="preserve"> Sometime a valid point of comparison is a theoretically best possible solution. This could be the solution that is not possible in practice, maybe because it needs global knowledge (in a distributed protocol), or no failure (in a fault-tolerant protocol). The reviewer then sees how close our protocol gets to this upper bound and this is intuitively appealing. </w:t>
+        <w:t xml:space="preserve"> Sometime a valid point of comparison is </w:t>
+      </w:r>
+      <w:proofErr w:type="gramStart"/>
+      <w:r>
+        <w:rPr>
+          <w:sz w:val="22"/>
+          <w:szCs w:val="22"/>
+        </w:rPr>
+        <w:t>a theoretically</w:t>
+      </w:r>
+      <w:proofErr w:type="gramEnd"/>
+      <w:r>
+        <w:rPr>
+          <w:sz w:val="22"/>
+          <w:szCs w:val="22"/>
+        </w:rPr>
+        <w:t xml:space="preserve"> best possible solution. This could be the solution that is not possible in practice, maybe because it needs global knowledge (in a distributed protocol), or no failure (in a fault-tolerant protocol). The reviewer then sees how close our protocol gets to this upper bound and this is intuitively appealing. </w:t>
       </w:r>
     </w:p>
     <w:p>
@@ -1999,7 +2440,55 @@
           <w:sz w:val="22"/>
           <w:szCs w:val="22"/>
         </w:rPr>
-        <w:t xml:space="preserve">, you will of course show the improvement due to your entire solution over the baselines (mentioned above). But you also need to show the relative contribution of each of the techniques in your solution to the improvement. So if your solution has techniques A, B, and C, then there should be a result that shows improvement separately for each of A, B, and C. Sometime it is also relevant to show the improvement due to combinations of these individual techniques. </w:t>
+        <w:t xml:space="preserve">, you will of course show </w:t>
+      </w:r>
+      <w:proofErr w:type="gramStart"/>
+      <w:r>
+        <w:rPr>
+          <w:sz w:val="22"/>
+          <w:szCs w:val="22"/>
+        </w:rPr>
+        <w:t>the improvement</w:t>
+      </w:r>
+      <w:proofErr w:type="gramEnd"/>
+      <w:r>
+        <w:rPr>
+          <w:sz w:val="22"/>
+          <w:szCs w:val="22"/>
+        </w:rPr>
+        <w:t xml:space="preserve"> due to your entire solution over the baselines (mentioned above). But you also need to show the relative contribution of each of the techniques in your solution to the improvement. </w:t>
+      </w:r>
+      <w:proofErr w:type="gramStart"/>
+      <w:r>
+        <w:rPr>
+          <w:sz w:val="22"/>
+          <w:szCs w:val="22"/>
+        </w:rPr>
+        <w:t>So</w:t>
+      </w:r>
+      <w:proofErr w:type="gramEnd"/>
+      <w:r>
+        <w:rPr>
+          <w:sz w:val="22"/>
+          <w:szCs w:val="22"/>
+        </w:rPr>
+        <w:t xml:space="preserve"> if your solution has techniques A, B, and C, then there should be a result that shows improvement separately for each of A, B, and C. </w:t>
+      </w:r>
+      <w:proofErr w:type="gramStart"/>
+      <w:r>
+        <w:rPr>
+          <w:sz w:val="22"/>
+          <w:szCs w:val="22"/>
+        </w:rPr>
+        <w:t>Sometime</w:t>
+      </w:r>
+      <w:proofErr w:type="gramEnd"/>
+      <w:r>
+        <w:rPr>
+          <w:sz w:val="22"/>
+          <w:szCs w:val="22"/>
+        </w:rPr>
+        <w:t xml:space="preserve"> it is also relevant to show the improvement due to combinations of these individual techniques. </w:t>
       </w:r>
     </w:p>
     <w:p>
@@ -2123,7 +2612,25 @@
           <w:sz w:val="22"/>
           <w:szCs w:val="22"/>
         </w:rPr>
-        <w:t xml:space="preserve">. Here you will go into what datasets you used, what machines you ran the experiments on, what configurations you used for foundational software that you used (like what version of PyTorch), and characteristics of users (if relevant). </w:t>
+        <w:t xml:space="preserve">. Here you will go into what datasets you used, what machines you ran the experiments on, what configurations you used for foundational software that you used (like what version of </w:t>
+      </w:r>
+      <w:proofErr w:type="spellStart"/>
+      <w:r>
+        <w:rPr>
+          <w:bCs/>
+          <w:sz w:val="22"/>
+          <w:szCs w:val="22"/>
+        </w:rPr>
+        <w:t>PyTorch</w:t>
+      </w:r>
+      <w:proofErr w:type="spellEnd"/>
+      <w:r>
+        <w:rPr>
+          <w:bCs/>
+          <w:sz w:val="22"/>
+          <w:szCs w:val="22"/>
+        </w:rPr>
+        <w:t xml:space="preserve">), and characteristics of users (if relevant). </w:t>
       </w:r>
     </w:p>
     <w:p>
@@ -2243,7 +2750,23 @@
           <w:sz w:val="22"/>
           <w:szCs w:val="22"/>
         </w:rPr>
-        <w:t xml:space="preserve">What is the experiment meant to show? Example (from our Eurosys ’16 paper): </w:t>
+        <w:t xml:space="preserve">What is the experiment meant to show? Example (from our </w:t>
+      </w:r>
+      <w:proofErr w:type="spellStart"/>
+      <w:r>
+        <w:rPr>
+          <w:sz w:val="22"/>
+          <w:szCs w:val="22"/>
+        </w:rPr>
+        <w:t>Eurosys</w:t>
+      </w:r>
+      <w:proofErr w:type="spellEnd"/>
+      <w:r>
+        <w:rPr>
+          <w:sz w:val="22"/>
+          <w:szCs w:val="22"/>
+        </w:rPr>
+        <w:t xml:space="preserve"> ’16 paper): </w:t>
       </w:r>
       <w:r>
         <w:rPr>
@@ -2375,7 +2898,23 @@
           <w:sz w:val="22"/>
           <w:szCs w:val="22"/>
         </w:rPr>
-        <w:t xml:space="preserve">You likely have specified in the introduction and the design sections what output metrics are relevant to this domain and on which you will show the improvement of your solution. It is useful to repeat that toward the beginning of the evaluation section and give a formal definition, perhaps with the mathematical formula. </w:t>
+        <w:t xml:space="preserve">You </w:t>
+      </w:r>
+      <w:proofErr w:type="gramStart"/>
+      <w:r>
+        <w:rPr>
+          <w:sz w:val="22"/>
+          <w:szCs w:val="22"/>
+        </w:rPr>
+        <w:t>likely have specified</w:t>
+      </w:r>
+      <w:proofErr w:type="gramEnd"/>
+      <w:r>
+        <w:rPr>
+          <w:sz w:val="22"/>
+          <w:szCs w:val="22"/>
+        </w:rPr>
+        <w:t xml:space="preserve"> in the introduction and the design sections what output metrics are relevant to this domain and on which you will show the improvement of your solution. It is useful to repeat that toward the beginning of the evaluation section and give a formal definition, perhaps with the mathematical formula. </w:t>
       </w:r>
     </w:p>
     <w:p>
@@ -2416,7 +2955,39 @@
           <w:sz w:val="22"/>
           <w:szCs w:val="22"/>
         </w:rPr>
-        <w:t xml:space="preserve">The macro experiments evaluate the system in its entirety, along with comparisons to the prior art. Here you vary the control parameters and show the behavior of the overall system (and the competitors) with respect to the output metrics. For the micro experiments, you evaluate the behavior of each part of the overall system. You vary the control parameters relevant to only that part of the system. This helps answer the question how much does each part of the solution contribute to the win from the overall system. Another form of micro evaluation is you evaluate the sensitivity of the performance of the overall system to various configuration parameters. Here you may have to show the competition as well to answer the question – over what range of parameter values do we win. </w:t>
+        <w:t xml:space="preserve">The macro experiments evaluate the system in its entirety, along with comparisons to the prior art. Here you vary the control parameters and show the behavior of the overall system (and the competitors) with respect to the output metrics. For the micro experiments, you evaluate the behavior of each part of the overall system. You vary the control parameters relevant to only that part of the system. This helps answer the question how much </w:t>
+      </w:r>
+      <w:proofErr w:type="gramStart"/>
+      <w:r>
+        <w:rPr>
+          <w:sz w:val="22"/>
+          <w:szCs w:val="22"/>
+        </w:rPr>
+        <w:t>does each part of the solution contribute</w:t>
+      </w:r>
+      <w:proofErr w:type="gramEnd"/>
+      <w:r>
+        <w:rPr>
+          <w:sz w:val="22"/>
+          <w:szCs w:val="22"/>
+        </w:rPr>
+        <w:t xml:space="preserve"> to the win from the overall system. Another form of micro evaluation is you evaluate the sensitivity of the performance of the overall system to various configuration parameters. Here you may have to show the competition as well to answer the question – over what range of parameter values </w:t>
+      </w:r>
+      <w:proofErr w:type="gramStart"/>
+      <w:r>
+        <w:rPr>
+          <w:sz w:val="22"/>
+          <w:szCs w:val="22"/>
+        </w:rPr>
+        <w:t>do we win</w:t>
+      </w:r>
+      <w:proofErr w:type="gramEnd"/>
+      <w:r>
+        <w:rPr>
+          <w:sz w:val="22"/>
+          <w:szCs w:val="22"/>
+        </w:rPr>
+        <w:t xml:space="preserve">. </w:t>
       </w:r>
     </w:p>
     <w:p>
@@ -2475,7 +3046,71 @@
           <w:sz w:val="22"/>
           <w:szCs w:val="22"/>
         </w:rPr>
-        <w:t xml:space="preserve">For the micro experiments, you evaluate the behavior of each part of the overall system. You vary the control parameters relevant to only that part of the system. This helps answer the question how much does each part of the solution contribute to the win for the overall system. Another form of micro evaluation is you evaluate the sensitivity of the performance of the overall system to various configuration parameters. Here you may have to show the competition as well to answer the question – over what range of parameter values do we win. </w:t>
+        <w:t xml:space="preserve">For </w:t>
+      </w:r>
+      <w:proofErr w:type="gramStart"/>
+      <w:r>
+        <w:rPr>
+          <w:sz w:val="22"/>
+          <w:szCs w:val="22"/>
+        </w:rPr>
+        <w:t>the micro</w:t>
+      </w:r>
+      <w:proofErr w:type="gramEnd"/>
+      <w:r>
+        <w:rPr>
+          <w:sz w:val="22"/>
+          <w:szCs w:val="22"/>
+        </w:rPr>
+        <w:t xml:space="preserve"> experiments, you evaluate the behavior of each part of the overall system. You vary the control parameters relevant to only that part of the system. This helps answer the </w:t>
+      </w:r>
+      <w:proofErr w:type="gramStart"/>
+      <w:r>
+        <w:rPr>
+          <w:sz w:val="22"/>
+          <w:szCs w:val="22"/>
+        </w:rPr>
+        <w:t>question</w:t>
+      </w:r>
+      <w:proofErr w:type="gramEnd"/>
+      <w:r>
+        <w:rPr>
+          <w:sz w:val="22"/>
+          <w:szCs w:val="22"/>
+        </w:rPr>
+        <w:t xml:space="preserve"> how much </w:t>
+      </w:r>
+      <w:proofErr w:type="gramStart"/>
+      <w:r>
+        <w:rPr>
+          <w:sz w:val="22"/>
+          <w:szCs w:val="22"/>
+        </w:rPr>
+        <w:t>does each part of the solution contribute</w:t>
+      </w:r>
+      <w:proofErr w:type="gramEnd"/>
+      <w:r>
+        <w:rPr>
+          <w:sz w:val="22"/>
+          <w:szCs w:val="22"/>
+        </w:rPr>
+        <w:t xml:space="preserve"> to the win for the overall system. Another form of micro evaluation is you evaluate the sensitivity of the performance of the overall system to various configuration parameters. Here you may have to show the competition as well to answer the question – over what range of parameter values </w:t>
+      </w:r>
+      <w:proofErr w:type="gramStart"/>
+      <w:r>
+        <w:rPr>
+          <w:sz w:val="22"/>
+          <w:szCs w:val="22"/>
+        </w:rPr>
+        <w:t>do we win</w:t>
+      </w:r>
+      <w:proofErr w:type="gramEnd"/>
+      <w:r>
+        <w:rPr>
+          <w:sz w:val="22"/>
+          <w:szCs w:val="22"/>
+        </w:rPr>
+        <w:t xml:space="preserve">. </w:t>
       </w:r>
     </w:p>
     <w:p>
@@ -2749,7 +3384,23 @@
           <w:sz w:val="22"/>
           <w:szCs w:val="22"/>
         </w:rPr>
-        <w:t xml:space="preserve">. Describe the distinguishing feature of each class and then spend </w:t>
+        <w:t xml:space="preserve">. Describe the distinguishing </w:t>
+      </w:r>
+      <w:proofErr w:type="gramStart"/>
+      <w:r>
+        <w:rPr>
+          <w:sz w:val="22"/>
+          <w:szCs w:val="22"/>
+        </w:rPr>
+        <w:t>feature</w:t>
+      </w:r>
+      <w:proofErr w:type="gramEnd"/>
+      <w:r>
+        <w:rPr>
+          <w:sz w:val="22"/>
+          <w:szCs w:val="22"/>
+        </w:rPr>
+        <w:t xml:space="preserve"> of each class and then spend </w:t>
       </w:r>
       <w:r>
         <w:rPr>
@@ -2806,7 +3457,23 @@
           <w:sz w:val="22"/>
           <w:szCs w:val="22"/>
         </w:rPr>
-        <w:t xml:space="preserve"> have to be so detailed that the reader can understand the protocol just by reading your paper. You have to give the angle that allows the reader to appreciate the difference between that work and your work.</w:t>
+        <w:t xml:space="preserve"> have to be so detailed that the reader can understand the protocol just by reading your paper. You </w:t>
+      </w:r>
+      <w:proofErr w:type="gramStart"/>
+      <w:r>
+        <w:rPr>
+          <w:sz w:val="22"/>
+          <w:szCs w:val="22"/>
+        </w:rPr>
+        <w:t>have to</w:t>
+      </w:r>
+      <w:proofErr w:type="gramEnd"/>
+      <w:r>
+        <w:rPr>
+          <w:sz w:val="22"/>
+          <w:szCs w:val="22"/>
+        </w:rPr>
+        <w:t xml:space="preserve"> give the angle that allows the reader to appreciate the difference between that work and your work.</w:t>
       </w:r>
       <w:r>
         <w:rPr>
@@ -2820,7 +3487,23 @@
           <w:sz w:val="22"/>
           <w:szCs w:val="22"/>
         </w:rPr>
-        <w:t xml:space="preserve">At the end of each category, you have to give the differentiator that your work has. </w:t>
+        <w:t xml:space="preserve">At the end of each category, you </w:t>
+      </w:r>
+      <w:proofErr w:type="gramStart"/>
+      <w:r>
+        <w:rPr>
+          <w:sz w:val="22"/>
+          <w:szCs w:val="22"/>
+        </w:rPr>
+        <w:t>have to</w:t>
+      </w:r>
+      <w:proofErr w:type="gramEnd"/>
+      <w:r>
+        <w:rPr>
+          <w:sz w:val="22"/>
+          <w:szCs w:val="22"/>
+        </w:rPr>
+        <w:t xml:space="preserve"> give the differentiator that your work has. </w:t>
       </w:r>
     </w:p>
     <w:p>
@@ -2841,7 +3524,39 @@
           <w:sz w:val="22"/>
           <w:szCs w:val="22"/>
         </w:rPr>
-        <w:t xml:space="preserve">Be very comprehensive in the list of papers that you cover. If you miss a paper that the reviewer has heard of, and may only be tangentially related to your work, and this is not referenced, then the reviewer may reject your paper for that. So add in all possible prior papers even if you do not think it is directly related. </w:t>
+        <w:t xml:space="preserve">Be very </w:t>
+      </w:r>
+      <w:proofErr w:type="gramStart"/>
+      <w:r>
+        <w:rPr>
+          <w:sz w:val="22"/>
+          <w:szCs w:val="22"/>
+        </w:rPr>
+        <w:t>comprehensive</w:t>
+      </w:r>
+      <w:proofErr w:type="gramEnd"/>
+      <w:r>
+        <w:rPr>
+          <w:sz w:val="22"/>
+          <w:szCs w:val="22"/>
+        </w:rPr>
+        <w:t xml:space="preserve"> in the list of papers that you cover. If you miss a paper that the reviewer has heard of, and may only be tangentially related to your work, and this is not referenced, then the reviewer may reject your paper for that. </w:t>
+      </w:r>
+      <w:proofErr w:type="gramStart"/>
+      <w:r>
+        <w:rPr>
+          <w:sz w:val="22"/>
+          <w:szCs w:val="22"/>
+        </w:rPr>
+        <w:t>So</w:t>
+      </w:r>
+      <w:proofErr w:type="gramEnd"/>
+      <w:r>
+        <w:rPr>
+          <w:sz w:val="22"/>
+          <w:szCs w:val="22"/>
+        </w:rPr>
+        <w:t xml:space="preserve"> add in all possible prior papers even if you do not think it is directly related. </w:t>
       </w:r>
     </w:p>
     <w:p>
@@ -2862,7 +3577,23 @@
           <w:sz w:val="22"/>
           <w:szCs w:val="22"/>
         </w:rPr>
-        <w:t xml:space="preserve">This does not come in the related work section but there is a motivating result table that comes in the introduction where you show a teaser result of your work vis-à-vis some closely related prior work. In the related work section, reference that table or figure plus mention which of the related works you are quantitatively comparing to in the results section. </w:t>
+        <w:t xml:space="preserve">This does not come in the related work section but there is a motivating result table that comes in the introduction where you show a teaser result of your work </w:t>
+      </w:r>
+      <w:proofErr w:type="gramStart"/>
+      <w:r>
+        <w:rPr>
+          <w:sz w:val="22"/>
+          <w:szCs w:val="22"/>
+        </w:rPr>
+        <w:t>vis-à-vis</w:t>
+      </w:r>
+      <w:proofErr w:type="gramEnd"/>
+      <w:r>
+        <w:rPr>
+          <w:sz w:val="22"/>
+          <w:szCs w:val="22"/>
+        </w:rPr>
+        <w:t xml:space="preserve"> some closely related prior work. In the related work section, reference that table or figure plus mention which of the related works you are quantitatively comparing to in the results section. </w:t>
       </w:r>
     </w:p>
     <w:p>
@@ -2916,58 +3647,33 @@
       </w:r>
       <w:r>
         <w:rPr>
-          <w:noProof/>
-          <w:sz w:val="22"/>
-          <w:szCs w:val="22"/>
-        </w:rPr>
-        <w:drawing>
-          <wp:inline distT="0" distB="0" distL="0" distR="0" wp14:anchorId="73B4AF9D" wp14:editId="7947221A">
-            <wp:extent cx="4528185" cy="2284095"/>
-            <wp:effectExtent l="0" t="0" r="0" b="0"/>
-            <wp:docPr id="1" name="Picture 1"/>
-            <wp:cNvGraphicFramePr>
-              <a:graphicFrameLocks xmlns:a="http://schemas.openxmlformats.org/drawingml/2006/main" noChangeAspect="1"/>
-            </wp:cNvGraphicFramePr>
-            <a:graphic xmlns:a="http://schemas.openxmlformats.org/drawingml/2006/main">
-              <a:graphicData uri="http://schemas.openxmlformats.org/drawingml/2006/picture">
-                <pic:pic xmlns:pic="http://schemas.openxmlformats.org/drawingml/2006/picture">
-                  <pic:nvPicPr>
-                    <pic:cNvPr id="0" name="Picture 1"/>
-                    <pic:cNvPicPr>
-                      <a:picLocks noChangeAspect="1" noChangeArrowheads="1"/>
-                    </pic:cNvPicPr>
-                  </pic:nvPicPr>
-                  <pic:blipFill>
-                    <a:blip r:embed="rId7">
-                      <a:extLst>
-                        <a:ext uri="{28A0092B-C50C-407E-A947-70E740481C1C}">
-                          <a14:useLocalDpi xmlns:a14="http://schemas.microsoft.com/office/drawing/2010/main" val="0"/>
-                        </a:ext>
-                      </a:extLst>
-                    </a:blip>
-                    <a:srcRect/>
-                    <a:stretch>
-                      <a:fillRect/>
-                    </a:stretch>
-                  </pic:blipFill>
-                  <pic:spPr bwMode="auto">
-                    <a:xfrm>
-                      <a:off x="0" y="0"/>
-                      <a:ext cx="4528185" cy="2284095"/>
-                    </a:xfrm>
-                    <a:prstGeom prst="rect">
-                      <a:avLst/>
-                    </a:prstGeom>
-                    <a:noFill/>
-                    <a:ln>
-                      <a:noFill/>
-                    </a:ln>
-                  </pic:spPr>
-                </pic:pic>
-              </a:graphicData>
-            </a:graphic>
-          </wp:inline>
-        </w:drawing>
+          <w:sz w:val="22"/>
+          <w:szCs w:val="22"/>
+        </w:rPr>
+        <w:pict w14:anchorId="73B4AF9D">
+          <v:shapetype id="_x0000_t75" coordsize="21600,21600" o:spt="75" o:preferrelative="t" path="m@4@5l@4@11@9@11@9@5xe" filled="f" stroked="f">
+            <v:stroke joinstyle="miter"/>
+            <v:formulas>
+              <v:f eqn="if lineDrawn pixelLineWidth 0"/>
+              <v:f eqn="sum @0 1 0"/>
+              <v:f eqn="sum 0 0 @1"/>
+              <v:f eqn="prod @2 1 2"/>
+              <v:f eqn="prod @3 21600 pixelWidth"/>
+              <v:f eqn="prod @3 21600 pixelHeight"/>
+              <v:f eqn="sum @0 0 1"/>
+              <v:f eqn="prod @6 1 2"/>
+              <v:f eqn="prod @7 21600 pixelWidth"/>
+              <v:f eqn="sum @8 21600 0"/>
+              <v:f eqn="prod @7 21600 pixelHeight"/>
+              <v:f eqn="sum @10 21600 0"/>
+            </v:formulas>
+            <v:path o:extrusionok="f" gradientshapeok="t" o:connecttype="rect"/>
+            <o:lock v:ext="edit" aspectratio="t"/>
+          </v:shapetype>
+          <v:shape id="_x0000_i1025" type="#_x0000_t75" style="width:356pt;height:180pt">
+            <v:imagedata r:id="rId7" o:title=""/>
+          </v:shape>
+        </w:pict>
       </w:r>
     </w:p>
     <w:p>
@@ -3050,7 +3756,7 @@
     <w:p>
       <w:pPr>
         <w:numPr>
-          <w:ilvl w:val="0"/>
+          <w:ilvl w:val="1"/>
           <w:numId w:val="3"/>
         </w:numPr>
         <w:spacing w:line="360" w:lineRule="auto"/>
@@ -3062,83 +3768,58 @@
       </w:pPr>
       <w:r>
         <w:rPr>
-          <w:b/>
-          <w:sz w:val="22"/>
-          <w:szCs w:val="22"/>
-        </w:rPr>
-        <w:t>Definition and Use</w:t>
-      </w:r>
-      <w:r>
-        <w:rPr>
-          <w:sz w:val="22"/>
-          <w:szCs w:val="22"/>
-        </w:rPr>
-        <w:t>:</w:t>
-      </w:r>
-      <w:r>
-        <w:rPr>
-          <w:sz w:val="22"/>
-          <w:szCs w:val="22"/>
-        </w:rPr>
-        <w:t xml:space="preserve"> Before you use any term (that is not considered universally known in the community – a judgment that comes with practice), you should define it. In the definition, the term should be in italics. In the definition, try to use the word “define” or one of its forms. Thus, “we define </w:t>
-      </w:r>
-      <w:r>
-        <w:rPr>
-          <w:i/>
-          <w:sz w:val="22"/>
-          <w:szCs w:val="22"/>
-        </w:rPr>
-        <w:t>precision</w:t>
-      </w:r>
-      <w:r>
-        <w:rPr>
-          <w:sz w:val="22"/>
-          <w:szCs w:val="22"/>
-        </w:rPr>
-        <w:t xml:space="preserve"> as …”. Sometime it is useful to set this apart so that it stands out. Thus:</w:t>
-      </w:r>
-    </w:p>
-    <w:p>
-      <w:pPr>
-        <w:spacing w:line="360" w:lineRule="auto"/>
-        <w:jc w:val="both"/>
-        <w:rPr>
-          <w:sz w:val="22"/>
-          <w:szCs w:val="22"/>
-        </w:rPr>
-      </w:pPr>
-      <w:r>
-        <w:rPr>
-          <w:i/>
-          <w:sz w:val="22"/>
-          <w:szCs w:val="22"/>
-        </w:rPr>
-        <w:t>Definition</w:t>
-      </w:r>
-      <w:r>
-        <w:rPr>
-          <w:sz w:val="22"/>
-          <w:szCs w:val="22"/>
-        </w:rPr>
-        <w:t xml:space="preserve">: Precision = TP/(TP+FP), where TP is the number of actual errors and TP+FP gives the number of errors flagged by the Monitor. </w:t>
-      </w:r>
-    </w:p>
-    <w:p>
-      <w:pPr>
-        <w:spacing w:before="120" w:line="360" w:lineRule="auto"/>
-        <w:ind w:left="360" w:firstLine="288"/>
-        <w:jc w:val="both"/>
-        <w:rPr>
-          <w:sz w:val="22"/>
-          <w:szCs w:val="22"/>
-        </w:rPr>
-      </w:pPr>
-      <w:r>
-        <w:rPr>
-          <w:sz w:val="22"/>
-          <w:szCs w:val="22"/>
-        </w:rPr>
-        <w:t xml:space="preserve">You should refer to the same thing by the same term, not by different terms, even if they are similar. For example, the reader is confused if he sees “confidence index”, “confidence value”, “reputation index”, “probability that the detection is correct” to refer to the same thing. </w:t>
+          <w:sz w:val="22"/>
+          <w:szCs w:val="22"/>
+        </w:rPr>
+        <w:t xml:space="preserve">Oftentimes Google Scholar will give the </w:t>
+      </w:r>
+      <w:proofErr w:type="spellStart"/>
+      <w:r>
+        <w:rPr>
+          <w:sz w:val="22"/>
+          <w:szCs w:val="22"/>
+        </w:rPr>
+        <w:t>arXiv</w:t>
+      </w:r>
+      <w:proofErr w:type="spellEnd"/>
+      <w:r>
+        <w:rPr>
+          <w:sz w:val="22"/>
+          <w:szCs w:val="22"/>
+        </w:rPr>
+        <w:t xml:space="preserve"> version of a paper, even though it has been accepted at a peer-reviewed venue (or sometimes appeared in one recently). In all such cases, reference the peer-reviewed version, not the </w:t>
+      </w:r>
+      <w:proofErr w:type="spellStart"/>
+      <w:r>
+        <w:rPr>
+          <w:sz w:val="22"/>
+          <w:szCs w:val="22"/>
+        </w:rPr>
+        <w:t>arXiv</w:t>
+      </w:r>
+      <w:proofErr w:type="spellEnd"/>
+      <w:r>
+        <w:rPr>
+          <w:sz w:val="22"/>
+          <w:szCs w:val="22"/>
+        </w:rPr>
+        <w:t xml:space="preserve"> version. This is particularly important for the baselines we are comparing our solution to. If we use an </w:t>
+      </w:r>
+      <w:proofErr w:type="spellStart"/>
+      <w:r>
+        <w:rPr>
+          <w:sz w:val="22"/>
+          <w:szCs w:val="22"/>
+        </w:rPr>
+        <w:t>arXiv</w:t>
+      </w:r>
+      <w:proofErr w:type="spellEnd"/>
+      <w:r>
+        <w:rPr>
+          <w:sz w:val="22"/>
+          <w:szCs w:val="22"/>
+        </w:rPr>
+        <w:t xml:space="preserve"> version, then it is easy for the reviewer to dismiss that baseline. </w:t>
       </w:r>
     </w:p>
     <w:p>
@@ -3160,6 +3841,117 @@
           <w:sz w:val="22"/>
           <w:szCs w:val="22"/>
         </w:rPr>
+        <w:t>Definition and Use</w:t>
+      </w:r>
+      <w:r>
+        <w:rPr>
+          <w:sz w:val="22"/>
+          <w:szCs w:val="22"/>
+        </w:rPr>
+        <w:t>:</w:t>
+      </w:r>
+      <w:r>
+        <w:rPr>
+          <w:sz w:val="22"/>
+          <w:szCs w:val="22"/>
+        </w:rPr>
+        <w:t xml:space="preserve"> Before you use any term (that is not considered universally known in the community – a judgment that comes with practice), you should define it. In the definition, the term should be in italics. In the definition, try to use the word “define” or one of its forms. Thus, “we define </w:t>
+      </w:r>
+      <w:r>
+        <w:rPr>
+          <w:i/>
+          <w:sz w:val="22"/>
+          <w:szCs w:val="22"/>
+        </w:rPr>
+        <w:t>precision</w:t>
+      </w:r>
+      <w:r>
+        <w:rPr>
+          <w:sz w:val="22"/>
+          <w:szCs w:val="22"/>
+        </w:rPr>
+        <w:t xml:space="preserve"> as …”. </w:t>
+      </w:r>
+      <w:proofErr w:type="gramStart"/>
+      <w:r>
+        <w:rPr>
+          <w:sz w:val="22"/>
+          <w:szCs w:val="22"/>
+        </w:rPr>
+        <w:t>Sometime</w:t>
+      </w:r>
+      <w:proofErr w:type="gramEnd"/>
+      <w:r>
+        <w:rPr>
+          <w:sz w:val="22"/>
+          <w:szCs w:val="22"/>
+        </w:rPr>
+        <w:t xml:space="preserve"> it is useful to set this apart so that it stands out. Thus:</w:t>
+      </w:r>
+    </w:p>
+    <w:p>
+      <w:pPr>
+        <w:spacing w:line="360" w:lineRule="auto"/>
+        <w:jc w:val="both"/>
+        <w:rPr>
+          <w:sz w:val="22"/>
+          <w:szCs w:val="22"/>
+        </w:rPr>
+      </w:pPr>
+      <w:r>
+        <w:rPr>
+          <w:i/>
+          <w:sz w:val="22"/>
+          <w:szCs w:val="22"/>
+        </w:rPr>
+        <w:t>Definition</w:t>
+      </w:r>
+      <w:r>
+        <w:rPr>
+          <w:sz w:val="22"/>
+          <w:szCs w:val="22"/>
+        </w:rPr>
+        <w:t xml:space="preserve">: Precision = TP/(TP+FP), where TP is the number of actual errors and TP+FP gives the number of errors flagged by the Monitor. </w:t>
+      </w:r>
+    </w:p>
+    <w:p>
+      <w:pPr>
+        <w:spacing w:before="120" w:line="360" w:lineRule="auto"/>
+        <w:ind w:left="360" w:firstLine="288"/>
+        <w:jc w:val="both"/>
+        <w:rPr>
+          <w:sz w:val="22"/>
+          <w:szCs w:val="22"/>
+        </w:rPr>
+      </w:pPr>
+      <w:r>
+        <w:rPr>
+          <w:sz w:val="22"/>
+          <w:szCs w:val="22"/>
+        </w:rPr>
+        <w:t xml:space="preserve">You should refer to the same thing by the same term, not by different terms, even if they are similar. For example, the reader is confused if he sees “confidence index”, “confidence value”, “reputation index”, “probability that the detection is correct” to refer to the same thing. </w:t>
+      </w:r>
+    </w:p>
+    <w:p>
+      <w:pPr>
+        <w:numPr>
+          <w:ilvl w:val="0"/>
+          <w:numId w:val="3"/>
+        </w:numPr>
+        <w:spacing w:line="360" w:lineRule="auto"/>
+        <w:jc w:val="both"/>
+        <w:rPr>
+          <w:sz w:val="22"/>
+          <w:szCs w:val="22"/>
+        </w:rPr>
+      </w:pPr>
+      <w:r>
+        <w:rPr>
+          <w:b/>
+          <w:sz w:val="22"/>
+          <w:szCs w:val="22"/>
+        </w:rPr>
+        <w:lastRenderedPageBreak/>
         <w:t>Discussion</w:t>
       </w:r>
       <w:r>
@@ -3209,15 +4001,7 @@
           <w:sz w:val="22"/>
           <w:szCs w:val="22"/>
         </w:rPr>
-        <w:t xml:space="preserve">otherwise, you would have already solved it in the </w:t>
-      </w:r>
-      <w:r>
-        <w:rPr>
-          <w:sz w:val="22"/>
-          <w:szCs w:val="22"/>
-        </w:rPr>
-        <w:lastRenderedPageBreak/>
-        <w:t>current design and implementation</w:t>
+        <w:t>otherwise, you would have already solved it in the current design and implementation</w:t>
       </w:r>
       <w:r>
         <w:rPr>
@@ -3317,35 +4101,44 @@
           <w:sz w:val="22"/>
           <w:szCs w:val="22"/>
         </w:rPr>
-        <w:t xml:space="preserve">What is the failure model or the adversary model: In this you explain what your assumption is about what kinds of failures your system can handle, or what power the adversary can have and you can still handle. If present this comes </w:t>
-      </w:r>
-      <w:r>
-        <w:rPr>
-          <w:sz w:val="22"/>
-          <w:szCs w:val="22"/>
-        </w:rPr>
-        <w:t xml:space="preserve">as the first part of </w:t>
-      </w:r>
-      <w:r>
-        <w:rPr>
-          <w:sz w:val="22"/>
-          <w:szCs w:val="22"/>
-        </w:rPr>
-        <w:t xml:space="preserve">the Overview section, or </w:t>
-      </w:r>
-      <w:r>
-        <w:rPr>
-          <w:sz w:val="22"/>
-          <w:szCs w:val="22"/>
-        </w:rPr>
-        <w:t xml:space="preserve">first part of </w:t>
-      </w:r>
-      <w:r>
-        <w:rPr>
-          <w:sz w:val="22"/>
-          <w:szCs w:val="22"/>
-        </w:rPr>
-        <w:t xml:space="preserve">the Detailed Design section. </w:t>
+        <w:t xml:space="preserve">What is the failure model or the </w:t>
+      </w:r>
+      <w:r>
+        <w:rPr>
+          <w:sz w:val="22"/>
+          <w:szCs w:val="22"/>
+        </w:rPr>
+        <w:t>threat/</w:t>
+      </w:r>
+      <w:r>
+        <w:rPr>
+          <w:sz w:val="22"/>
+          <w:szCs w:val="22"/>
+        </w:rPr>
+        <w:t xml:space="preserve">adversary model: In this you explain what your assumption is about what kinds of failures your system can handle, or what power the adversary can </w:t>
+      </w:r>
+      <w:proofErr w:type="gramStart"/>
+      <w:r>
+        <w:rPr>
+          <w:sz w:val="22"/>
+          <w:szCs w:val="22"/>
+        </w:rPr>
+        <w:t>have</w:t>
+      </w:r>
+      <w:proofErr w:type="gramEnd"/>
+      <w:r>
+        <w:rPr>
+          <w:sz w:val="22"/>
+          <w:szCs w:val="22"/>
+        </w:rPr>
+        <w:t xml:space="preserve"> and you can still handle. </w:t>
+      </w:r>
+      <w:r>
+        <w:rPr>
+          <w:sz w:val="22"/>
+          <w:szCs w:val="22"/>
+        </w:rPr>
+        <w:t xml:space="preserve">This would come in a section right after the Introduction, titled as “Threat model and assumptions” or a subsection within “Background”. </w:t>
       </w:r>
     </w:p>
     <w:p>
@@ -3380,14 +4173,60 @@
           <w:sz w:val="22"/>
           <w:szCs w:val="22"/>
         </w:rPr>
-        <w:t xml:space="preserve"> what modifications does she need to make to her usual workflow, what inputs must she provide, what hints she may optionally provide. </w:t>
-      </w:r>
-      <w:r>
-        <w:rPr>
-          <w:sz w:val="22"/>
-          <w:szCs w:val="22"/>
-        </w:rPr>
-        <w:t xml:space="preserve">This typically comes early in the Design section. </w:t>
+        <w:t xml:space="preserve"> what modifications does she </w:t>
+      </w:r>
+      <w:proofErr w:type="gramStart"/>
+      <w:r>
+        <w:rPr>
+          <w:sz w:val="22"/>
+          <w:szCs w:val="22"/>
+        </w:rPr>
+        <w:t>need</w:t>
+      </w:r>
+      <w:proofErr w:type="gramEnd"/>
+      <w:r>
+        <w:rPr>
+          <w:sz w:val="22"/>
+          <w:szCs w:val="22"/>
+        </w:rPr>
+        <w:t xml:space="preserve"> to make to her usual workflow, what inputs </w:t>
+      </w:r>
+      <w:proofErr w:type="gramStart"/>
+      <w:r>
+        <w:rPr>
+          <w:sz w:val="22"/>
+          <w:szCs w:val="22"/>
+        </w:rPr>
+        <w:t>must she</w:t>
+      </w:r>
+      <w:proofErr w:type="gramEnd"/>
+      <w:r>
+        <w:rPr>
+          <w:sz w:val="22"/>
+          <w:szCs w:val="22"/>
+        </w:rPr>
+        <w:t xml:space="preserve"> provide, what hints she may optionally provide. </w:t>
+      </w:r>
+      <w:r>
+        <w:rPr>
+          <w:sz w:val="22"/>
+          <w:szCs w:val="22"/>
+        </w:rPr>
+        <w:t xml:space="preserve">This typically comes </w:t>
+      </w:r>
+      <w:r>
+        <w:rPr>
+          <w:sz w:val="22"/>
+          <w:szCs w:val="22"/>
+        </w:rPr>
+        <w:t>in the same section as #1 above</w:t>
+      </w:r>
+      <w:r>
+        <w:rPr>
+          <w:sz w:val="22"/>
+          <w:szCs w:val="22"/>
+        </w:rPr>
+        <w:t xml:space="preserve">. </w:t>
       </w:r>
     </w:p>
     <w:p>
@@ -3472,7 +4311,23 @@
           <w:sz w:val="22"/>
           <w:szCs w:val="22"/>
         </w:rPr>
-        <w:t>Use the first person plural, i.e., “We discovered that the speed of light is 3 × 10</w:t>
+        <w:t xml:space="preserve">Use the </w:t>
+      </w:r>
+      <w:proofErr w:type="gramStart"/>
+      <w:r>
+        <w:rPr>
+          <w:sz w:val="22"/>
+          <w:szCs w:val="22"/>
+        </w:rPr>
+        <w:t>first person</w:t>
+      </w:r>
+      <w:proofErr w:type="gramEnd"/>
+      <w:r>
+        <w:rPr>
+          <w:sz w:val="22"/>
+          <w:szCs w:val="22"/>
+        </w:rPr>
+        <w:t xml:space="preserve"> plural, i.e., “We discovered that the speed of light is 3 × 10</w:t>
       </w:r>
       <w:r>
         <w:rPr>
@@ -3488,6 +4343,27 @@
           <w:szCs w:val="22"/>
         </w:rPr>
         <w:t xml:space="preserve"> m/s.”</w:t>
+      </w:r>
+    </w:p>
+    <w:p>
+      <w:pPr>
+        <w:numPr>
+          <w:ilvl w:val="1"/>
+          <w:numId w:val="3"/>
+        </w:numPr>
+        <w:spacing w:line="360" w:lineRule="auto"/>
+        <w:jc w:val="both"/>
+        <w:rPr>
+          <w:sz w:val="22"/>
+          <w:szCs w:val="22"/>
+        </w:rPr>
+      </w:pPr>
+      <w:r>
+        <w:rPr>
+          <w:sz w:val="22"/>
+          <w:szCs w:val="22"/>
+        </w:rPr>
+        <w:t xml:space="preserve">Do not use different terms to refer to the same concept. Example: “Semantics-aware background attack” and “Semantics-driven background attack”. Choose one term and stick to that. </w:t>
       </w:r>
     </w:p>
     <w:sectPr>

</xml_diff>